<commit_message>
feat: Triển khai module quản lý kho xe với các chức năng nhập/xuất kho và tạo tài liệu liên quan.
</commit_message>
<xml_diff>
--- a/src/main/resources/templates/GiaiNgan/y-kien-quan-tri.docx
+++ b/src/main/resources/templates/GiaiNgan/y-kien-quan-tri.docx
@@ -122,10 +122,10 @@
         <w:tblLook w:val="04A0" w:firstRow="1" w:lastRow="0" w:firstColumn="1" w:lastColumn="0" w:noHBand="0" w:noVBand="1"/>
       </w:tblPr>
       <w:tblGrid>
-        <w:gridCol w:w="890"/>
-        <w:gridCol w:w="3661"/>
+        <w:gridCol w:w="891"/>
+        <w:gridCol w:w="3656"/>
         <w:gridCol w:w="1807"/>
-        <w:gridCol w:w="3213"/>
+        <w:gridCol w:w="3217"/>
       </w:tblGrid>
       <w:tr>
         <w:trPr>
@@ -331,9 +331,8 @@
                 <w:sz w:val="20"/>
                 <w:szCs w:val="20"/>
               </w:rPr>
-              <w:t>Thanh toán {{guarantee_rate</w:t>
+              <w:t>Thanh toán {{</w:t>
             </w:r>
-            <w:proofErr w:type="gramStart"/>
             <w:r>
               <w:rPr>
                 <w:rFonts w:ascii="Times New Roman" w:hAnsi="Times New Roman" w:cs="Times New Roman"/>
@@ -341,9 +340,8 @@
                 <w:sz w:val="20"/>
                 <w:szCs w:val="20"/>
               </w:rPr>
-              <w:t>}}%</w:t>
+              <w:t>g</w:t>
             </w:r>
-            <w:proofErr w:type="gramEnd"/>
             <w:r>
               <w:rPr>
                 <w:rFonts w:ascii="Times New Roman" w:hAnsi="Times New Roman" w:cs="Times New Roman"/>
@@ -351,7 +349,7 @@
                 <w:sz w:val="20"/>
                 <w:szCs w:val="20"/>
               </w:rPr>
-              <w:t xml:space="preserve"> giá trị </w:t>
+              <w:t xml:space="preserve">ate}}% giá trị </w:t>
             </w:r>
             <w:r>
               <w:rPr>
@@ -402,27 +400,7 @@
                 <w:sz w:val="20"/>
                 <w:szCs w:val="20"/>
               </w:rPr>
-              <w:t>theo bảo lãnh thanh toán số: {{TBL</w:t>
-            </w:r>
-            <w:proofErr w:type="gramStart"/>
-            <w:r>
-              <w:rPr>
-                <w:rFonts w:ascii="Times New Roman" w:hAnsi="Times New Roman" w:cs="Times New Roman"/>
-                <w:color w:val="6373BA"/>
-                <w:sz w:val="20"/>
-                <w:szCs w:val="20"/>
-              </w:rPr>
-              <w:t>}}(</w:t>
-            </w:r>
-            <w:proofErr w:type="gramEnd"/>
-            <w:r>
-              <w:rPr>
-                <w:rFonts w:ascii="Times New Roman" w:hAnsi="Times New Roman" w:cs="Times New Roman"/>
-                <w:color w:val="6373BA"/>
-                <w:sz w:val="20"/>
-                <w:szCs w:val="20"/>
-              </w:rPr>
-              <w:t>Ref: {{REF}}) ngày 46063</w:t>
+              <w:t>theo bảo lãnh thanh toán số: {{TBL}}(Ref: {{REF}}) ngày 46063</w:t>
             </w:r>
           </w:p>
         </w:tc>
@@ -673,26 +651,16 @@
           <w:i/>
           <w:sz w:val="24"/>
         </w:rPr>
-        <w:t>total_vehicle_</w:t>
-      </w:r>
-      <w:proofErr w:type="gramStart"/>
+        <w:t>total_vehicle_tex</w:t>
+      </w:r>
       <w:r>
         <w:rPr>
           <w:rFonts w:ascii="Times New Roman" w:eastAsia="Times New Roman" w:hAnsi="Times New Roman" w:cs="Times New Roman"/>
           <w:i/>
           <w:sz w:val="24"/>
         </w:rPr>
-        <w:t>tex</w:t>
-      </w:r>
-      <w:r>
-        <w:rPr>
-          <w:rFonts w:ascii="Times New Roman" w:eastAsia="Times New Roman" w:hAnsi="Times New Roman" w:cs="Times New Roman"/>
-          <w:i/>
-          <w:sz w:val="24"/>
-        </w:rPr>
         <w:t>t}})</w:t>
       </w:r>
-      <w:proofErr w:type="gramEnd"/>
     </w:p>
     <w:p>
       <w:pPr>
@@ -780,18 +748,8 @@
           <w:color w:val="000099"/>
           <w:sz w:val="24"/>
         </w:rPr>
-        <w:t xml:space="preserve">Theo đề xuất của </w:t>
-      </w:r>
-      <w:proofErr w:type="gramStart"/>
-      <w:r>
-        <w:rPr>
-          <w:rFonts w:ascii="Times New Roman" w:eastAsia="Times New Roman" w:hAnsi="Times New Roman" w:cs="Times New Roman"/>
-          <w:color w:val="000099"/>
-          <w:sz w:val="24"/>
-        </w:rPr>
-        <w:t>P.KHDN</w:t>
-      </w:r>
-      <w:proofErr w:type="gramEnd"/>
+        <w:t>Theo đề xuất của P.KHDN</w:t>
+      </w:r>
     </w:p>
     <w:p>
       <w:pPr>

</xml_diff>